<commit_message>
chore(qim): 600 production scripts content pass + pipeline helpers + 深度审校 report
</commit_message>
<xml_diff>
--- a/qiminyaosu/ralph/生产稿_600/01_衣事/现代齐民要术_01-01-1_洗衣液是不是越多越干净？_生产稿.docx
+++ b/qiminyaosu/ralph/生产稿_600/01_衣事/现代齐民要术_01-01-1_洗衣液是不是越多越干净？_生产稿.docx
@@ -160,7 +160,7 @@
     </w:p>
     <w:p>
       <w:r>
-        <w:t>CORE_CONCLUSION：围绕「洗衣液是不是越多越干净？」，给出一个普通家庭能照做的一句判断/结论；判断建立在母题变量（表面活性剂与污垢分散、衣量/水量/污渍程度与剂量、过量导致的漂洗负担与残留、粉/液/凝珠的使用场景与成本）之上，并标出适用条件与例外。</w:t>
+        <w:t>CORE_CONCLUSION：洗衣液不是越多越好：洗净靠水流+机械作用+洗涤剂共同完成，过量不更干净，反增漂洗负担与残留。</w:t>
       </w:r>
     </w:p>
     <w:p>
@@ -192,6 +192,20 @@
       </w:r>
     </w:p>
     <w:p>
+      <w:r>
+        <w:rPr>
+          <w:b/>
+        </w:rPr>
+        <w:t>【深度审校备注】核实：常识，稳定。用量给区间不给绝对值。</w:t>
+      </w:r>
+      <w:r>
+        <w:t xml:space="preserve">　边界：不同机型/浓度用量不同。</w:t>
+      </w:r>
+      <w:r>
+        <w:t xml:space="preserve">　风险等级：低</w:t>
+      </w:r>
+    </w:p>
+    <w:p>
       <w:pPr>
         <w:pStyle w:val="Heading1"/>
       </w:pPr>
@@ -201,7 +215,7 @@
     </w:p>
     <w:p>
       <w:r>
-        <w:t>A. 反常识：沿用「洗衣液是不是越多越干净？」做一句与直觉相反的开场。</w:t>
+        <w:t>A. 反常识(可选成片钩子)：洗衣液倒得越多衣服越干净？不对。</w:t>
       </w:r>
     </w:p>
     <w:p>
@@ -723,13 +737,7 @@
     </w:p>
     <w:p>
       <w:r>
-        <w:rPr>
-          <w:b/>
-        </w:rPr>
-        <w:t>START_FRAME：</w:t>
-      </w:r>
-      <w:r>
-        <w:t>现代中国城市家庭洗衣阳台：米白墙面、浅木储物柜、白色前开门滚筒洗衣机、灰白台面，上午左侧自然光；主体与开头相扣。</w:t>
+        <w:t>START_FRAME（首帧·五锁）：同一衣事空间近景：浅色棉质衣物/织物居中，洗衣阳台、滚筒洗衣机环境清晰，上午左侧自然光，光比柔和，构图以洗衣液是不是越多越干净？对应的冲突对象为主体。</w:t>
       </w:r>
     </w:p>
     <w:p>
@@ -767,13 +775,7 @@
     </w:p>
     <w:p>
       <w:r>
-        <w:rPr>
-          <w:b/>
-        </w:rPr>
-        <w:t>END_FRAME：</w:t>
-      </w:r>
-      <w:r>
-        <w:t>稳定停在可桥接的尾帧，作下一镜首帧。</w:t>
+        <w:t>END_FRAME（尾帧·五锁）：镜头稳定停在衣事空间的一个清晰物件/结构上（浅色棉质衣物/织物，上午左侧自然光，光比柔和），形态位置与下一镜首帧一致，作桥接帧。</w:t>
       </w:r>
     </w:p>
     <w:p>
@@ -816,7 +818,10 @@
     </w:p>
     <w:p>
       <w:r>
-        <w:t>9:16 竖屏，高级半写实 3D/2.5D 现代家庭科学动画。现代中国城市家庭洗衣阳台：米白墙面、浅木储物柜、白色前开门滚筒洗衣机、灰白台面，上午左侧自然光。0—3s 引入「洗衣液是不是越多越干净？」主视觉事件；3—7s 演示/讲解机制与操作；7—10s 收束停在尾帧。无中文文字/字幕/Logo/水印；保持同一光线与镜头空间；无伪实验/伪专家；不出现可读数字表格。</w:t>
+        <w:rPr>
+          <w:b w:val="0"/>
+        </w:rPr>
+        <w:t>9:16 竖屏，高级半写实 3D/2.5D 现代家庭科学动画。现代中国家庭洗衣阳台：米白墙面、浅木储物柜、白色前开门滚筒洗衣机、灰白台面，上午左侧自然光。本镜主题「洗衣液是不是越多越干净？」（母题变量：表面活性剂与污垢分散、衣量/水量/污渍程度与剂量、过量导致的漂洗负担与残留、粉/液/凝珠的使用场景与成本）。0—3s：放大冲突/常见错误，前1-3秒制造留存；3—7s：用连续镜头把机制或做法讲透；7—10s：收束停在悬念、判断点。本段采用错误/正确左右并置的中分对比画面（A/B对照）。本段末句给出可收藏的一句话判断。动画风格借用：纤维微观 / 污渍脱落 / 水膜泡沫 / 滚筒机械运动 / 布料变形。镜头最后稳定帧直接作为下一镜首帧。。无中文文字/字幕/Logo/水印/名牌；不改变衣服/材质/产品外观颜色；不出现可读数字表格；不做伪实景/伪医生/伪检测画面。</w:t>
       </w:r>
     </w:p>
     <w:p/>
@@ -863,13 +868,7 @@
     </w:p>
     <w:p>
       <w:r>
-        <w:rPr>
-          <w:b/>
-        </w:rPr>
-        <w:t>START_FRAME：</w:t>
-      </w:r>
-      <w:r>
-        <w:t>现代中国城市家庭洗衣阳台：米白墙面、浅木储物柜、白色前开门滚筒洗衣机、灰白台面，上午左侧自然光；主体与开头相扣。</w:t>
+        <w:t>START_FRAME（首帧·五锁）：自上一镜尾帧继承：浅色棉质衣物/织物保持相同形态/材质/位置，上午左侧自然光，光比柔和，构图连续（五锁）。</w:t>
       </w:r>
     </w:p>
     <w:p>
@@ -907,13 +906,7 @@
     </w:p>
     <w:p>
       <w:r>
-        <w:rPr>
-          <w:b/>
-        </w:rPr>
-        <w:t>END_FRAME：</w:t>
-      </w:r>
-      <w:r>
-        <w:t>稳定停在可桥接的尾帧，作下一镜首帧。</w:t>
+        <w:t>END_FRAME（尾帧·五锁）：镜头稳定停在衣事空间的一个清晰物件/结构上（浅色棉质衣物/织物，上午左侧自然光，光比柔和），形态位置与下一镜首帧一致，作桥接帧。</w:t>
       </w:r>
     </w:p>
     <w:p>
@@ -956,7 +949,10 @@
     </w:p>
     <w:p>
       <w:r>
-        <w:t>9:16 竖屏，高级半写实 3D/2.5D 现代家庭科学动画。现代中国城市家庭洗衣阳台：米白墙面、浅木储物柜、白色前开门滚筒洗衣机、灰白台面，上午左侧自然光。0—3s 引入「洗衣液是不是越多越干净？」主视觉事件；3—7s 演示/讲解机制与操作；7—10s 收束停在尾帧。无中文文字/字幕/Logo/水印；保持同一光线与镜头空间；无伪实验/伪专家；不出现可读数字表格。</w:t>
+        <w:rPr>
+          <w:b w:val="0"/>
+        </w:rPr>
+        <w:t>9:16 竖屏，高级半写实 3D/2.5D 现代家庭科学动画。现代中国家庭洗衣阳台：米白墙面、浅木储物柜、白色前开门滚筒洗衣机、灰白台面，上午左侧自然光。本镜主题「洗衣液是不是越多越干净？」（母题变量：表面活性剂与污垢分散、衣量/水量/污渍程度与剂量、过量导致的漂洗负担与残留、粉/液/凝珠的使用场景与成本）。0—3s：从日常画面进入微观/剖面/透视；3—7s：用粒子、流动、结构示意表现机制；7—10s：从示意回到现实并落点。本段采用错误/正确左右并置的中分对比画面（A/B对照）。本段末句给出可收藏的一句话判断。动画风格借用：纤维微观 / 污渍脱落 / 水膜泡沫 / 滚筒机械运动 / 布料变形。镜头最后稳定帧直接作为下一镜首帧。。无中文文字/字幕/Logo/水印/名牌；不改变衣服/材质/产品外观颜色；不出现可读数字表格；不做伪实景/伪医生/伪检测画面。</w:t>
       </w:r>
     </w:p>
     <w:p/>
@@ -1003,13 +999,7 @@
     </w:p>
     <w:p>
       <w:r>
-        <w:rPr>
-          <w:b/>
-        </w:rPr>
-        <w:t>START_FRAME：</w:t>
-      </w:r>
-      <w:r>
-        <w:t>现代中国城市家庭洗衣阳台：米白墙面、浅木储物柜、白色前开门滚筒洗衣机、灰白台面，上午左侧自然光；主体与开头相扣。</w:t>
+        <w:t>START_FRAME（首帧·五锁）：自上一镜尾帧继承：浅色棉质衣物/织物保持相同形态/材质/位置，上午左侧自然光，光比柔和，构图连续（五锁）。</w:t>
       </w:r>
     </w:p>
     <w:p>
@@ -1047,13 +1037,7 @@
     </w:p>
     <w:p>
       <w:r>
-        <w:rPr>
-          <w:b/>
-        </w:rPr>
-        <w:t>END_FRAME：</w:t>
-      </w:r>
-      <w:r>
-        <w:t>稳定停在可桥接的尾帧，作下一镜首帧。</w:t>
+        <w:t>END_FRAME（尾帧·五锁）：镜头稳定停在衣事空间完成态（浅色棉质衣物/织物，上午左侧自然光，光比柔和），画面右下留出供后期放品牌/片尾。</w:t>
       </w:r>
     </w:p>
     <w:p>
@@ -1096,7 +1080,10 @@
     </w:p>
     <w:p>
       <w:r>
-        <w:t>9:16 竖屏，高级半写实 3D/2.5D 现代家庭科学动画。现代中国城市家庭洗衣阳台：米白墙面、浅木储物柜、白色前开门滚筒洗衣机、灰白台面，上午左侧自然光。0—3s 引入「洗衣液是不是越多越干净？」主视觉事件；3—7s 演示/讲解机制与操作；7—10s 收束停在尾帧。无中文文字/字幕/Logo/水印；保持同一光线与镜头空间；无伪实验/伪专家；不出现可读数字表格。</w:t>
+        <w:rPr>
+          <w:b w:val="0"/>
+        </w:rPr>
+        <w:t>9:16 竖屏，高级半写实 3D/2.5D 现代家庭科学动画。现代中国家庭洗衣阳台：米白墙面、浅木储物柜、白色前开门滚筒洗衣机、灰白台面，上午左侧自然光。本镜主题「洗衣液是不是越多越干净？」（母题变量：表面活性剂与污垢分散、衣量/水量/污渍程度与剂量、过量导致的漂洗负担与残留、粉/液/凝珠的使用场景与成本）。0—3s：固定出错对象，给出步骤起点；3—7s：镜头跟随手或物件依序完成动作；7—10s：停在正确完成的结果。本段采用错误/正确左右并置的中分对比画面（A/B对照）。本段末句给出可收藏的一句话判断。动画风格借用：纤维微观 / 污渍脱落 / 水膜泡沫 / 滚筒机械运动 / 布料变形。末尾稳定停帧，右下留出供后期加品牌/片尾。。无中文文字/字幕/Logo/水印/名牌；不改变衣服/材质/产品外观颜色；不出现可读数字表格；不做伪实景/伪医生/伪检测画面。</w:t>
       </w:r>
     </w:p>
     <w:p/>

</xml_diff>